<commit_message>
docs(manuales): R2 technical summary with review guide; T3 §8.1 health verdict is two levels plus a history category
Co-Authored-By: Claude Fable 5.1 <noreply@anthropic.com>
</commit_message>
<xml_diff>
--- a/docs/manuales/word/SIGeV-T3-Instalacion-despliegue-operacion.docx
+++ b/docs/manuales/word/SIGeV-T3-Instalacion-despliegue-operacion.docx
@@ -382,19 +382,6 @@
     </w:p>
     <w:p>
       <w:pPr>
-        <w:spacing w:after="60"/>
-      </w:pPr>
-    </w:p>
-    <w:p>
-      <w:pPr>
-        <w:pBdr>
-          <w:bottom w:val="single" w:color="999999" w:sz="6" w:space="1"/>
-        </w:pBdr>
-        <w:spacing w:after="200"/>
-      </w:pPr>
-    </w:p>
-    <w:p>
-      <w:pPr>
         <w:pStyle w:val="Heading1"/>
         <w:pageBreakBefore/>
       </w:pPr>
@@ -548,7 +535,7 @@
     </w:tbl>
     <w:p>
       <w:pPr>
-        <w:spacing w:after="120"/>
+        <w:spacing w:after="0" w:before="0"/>
       </w:pPr>
     </w:p>
     <w:p>
@@ -757,7 +744,7 @@
     </w:tbl>
     <w:p>
       <w:pPr>
-        <w:spacing w:after="120"/>
+        <w:spacing w:after="0" w:before="0"/>
       </w:pPr>
     </w:p>
     <w:p>
@@ -904,7 +891,7 @@
     </w:tbl>
     <w:p>
       <w:pPr>
-        <w:spacing w:after="120"/>
+        <w:spacing w:after="0" w:before="0"/>
       </w:pPr>
     </w:p>
     <w:p>
@@ -1106,7 +1093,7 @@
     </w:tbl>
     <w:p>
       <w:pPr>
-        <w:spacing w:after="120"/>
+        <w:spacing w:after="0" w:before="0"/>
       </w:pPr>
     </w:p>
     <w:p>
@@ -1480,7 +1467,7 @@
     </w:tbl>
     <w:p>
       <w:pPr>
-        <w:spacing w:after="120"/>
+        <w:spacing w:after="0" w:before="0"/>
       </w:pPr>
     </w:p>
     <w:tbl>
@@ -2056,7 +2043,7 @@
     </w:tbl>
     <w:p>
       <w:pPr>
-        <w:spacing w:after="120"/>
+        <w:spacing w:after="0" w:before="0"/>
       </w:pPr>
     </w:p>
     <w:p>
@@ -2169,7 +2156,7 @@
     </w:tbl>
     <w:p>
       <w:pPr>
-        <w:spacing w:after="120"/>
+        <w:spacing w:after="0" w:before="0"/>
       </w:pPr>
     </w:p>
     <w:p>
@@ -2453,7 +2440,7 @@
     </w:tbl>
     <w:p>
       <w:pPr>
-        <w:spacing w:after="120"/>
+        <w:spacing w:after="0" w:before="0"/>
       </w:pPr>
     </w:p>
     <w:p>
@@ -2626,14 +2613,6 @@
       <w:r>
         <w:t xml:space="preserve">.</w:t>
       </w:r>
-    </w:p>
-    <w:p>
-      <w:pPr>
-        <w:pBdr>
-          <w:bottom w:val="single" w:color="999999" w:sz="6" w:space="1"/>
-        </w:pBdr>
-        <w:spacing w:after="200"/>
-      </w:pPr>
     </w:p>
     <w:p>
       <w:pPr>
@@ -4661,7 +4640,7 @@
     </w:tbl>
     <w:p>
       <w:pPr>
-        <w:spacing w:after="120"/>
+        <w:spacing w:after="0" w:before="0"/>
       </w:pPr>
     </w:p>
     <w:p>
@@ -4783,14 +4762,6 @@
       <w:r>
         <w:t xml:space="preserve">.</w:t>
       </w:r>
-    </w:p>
-    <w:p>
-      <w:pPr>
-        <w:pBdr>
-          <w:bottom w:val="single" w:color="999999" w:sz="6" w:space="1"/>
-        </w:pBdr>
-        <w:spacing w:after="200"/>
-      </w:pPr>
     </w:p>
     <w:p>
       <w:pPr>
@@ -5686,7 +5657,7 @@
     </w:tbl>
     <w:p>
       <w:pPr>
-        <w:spacing w:after="120"/>
+        <w:spacing w:after="0" w:before="0"/>
       </w:pPr>
     </w:p>
     <w:p>
@@ -5869,14 +5840,6 @@
       <w:r>
         <w:t xml:space="preserve">.</w:t>
       </w:r>
-    </w:p>
-    <w:p>
-      <w:pPr>
-        <w:pBdr>
-          <w:bottom w:val="single" w:color="999999" w:sz="6" w:space="1"/>
-        </w:pBdr>
-        <w:spacing w:after="200"/>
-      </w:pPr>
     </w:p>
     <w:p>
       <w:pPr>
@@ -6179,17 +6142,12 @@
           <w:ilvl w:val="0"/>
           <w:numId w:val="2"/>
         </w:numPr>
-        <w:spacing w:after="60"/>
+        <w:spacing w:after="240"/>
       </w:pPr>
       <w:r>
         <w:t xml:space="preserve">Vaciar la cabecera de IP que manda el cliente antes de proxear, para que sólo valga la que
 resolvió el módulo de IP real.</w:t>
       </w:r>
-    </w:p>
-    <w:p>
-      <w:pPr>
-        <w:spacing w:after="60"/>
-      </w:pPr>
     </w:p>
     <w:p>
       <w:pPr>
@@ -6300,17 +6258,12 @@
           <w:ilvl w:val="0"/>
           <w:numId w:val="3"/>
         </w:numPr>
-        <w:spacing w:after="60"/>
+        <w:spacing w:after="240"/>
       </w:pPr>
       <w:r>
         <w:t xml:space="preserve">Las portadas de noticias se sirven por una ruta pública con caché inmutable, así que el
 borde las cachea; es contenido público y así está previsto.</w:t>
       </w:r>
-    </w:p>
-    <w:p>
-      <w:pPr>
-        <w:spacing w:after="60"/>
-      </w:pPr>
     </w:p>
     <w:p>
       <w:pPr>
@@ -6568,14 +6521,6 @@
       <w:r>
         <w:t xml:space="preserve"> §1 y §2.</w:t>
       </w:r>
-    </w:p>
-    <w:p>
-      <w:pPr>
-        <w:pBdr>
-          <w:bottom w:val="single" w:color="999999" w:sz="6" w:space="1"/>
-        </w:pBdr>
-        <w:spacing w:after="200"/>
-      </w:pPr>
     </w:p>
     <w:p>
       <w:pPr>
@@ -6648,7 +6593,7 @@
     </w:tbl>
     <w:p>
       <w:pPr>
-        <w:spacing w:after="120"/>
+        <w:spacing w:after="0" w:before="0"/>
       </w:pPr>
     </w:p>
     <w:tbl>
@@ -7104,7 +7049,7 @@
     </w:tbl>
     <w:p>
       <w:pPr>
-        <w:spacing w:after="120"/>
+        <w:spacing w:after="0" w:before="0"/>
       </w:pPr>
     </w:p>
     <w:p>
@@ -7341,7 +7286,7 @@
     </w:tbl>
     <w:p>
       <w:pPr>
-        <w:spacing w:after="120"/>
+        <w:spacing w:after="0" w:before="0"/>
       </w:pPr>
     </w:p>
     <w:p>
@@ -7487,7 +7432,7 @@
     </w:tbl>
     <w:p>
       <w:pPr>
-        <w:spacing w:after="120"/>
+        <w:spacing w:after="0" w:before="0"/>
       </w:pPr>
     </w:p>
     <w:p>
@@ -7743,7 +7688,7 @@
     </w:tbl>
     <w:p>
       <w:pPr>
-        <w:spacing w:after="120"/>
+        <w:spacing w:after="0" w:before="0"/>
       </w:pPr>
     </w:p>
     <w:p>
@@ -7944,14 +7889,6 @@
       <w:r>
         <w:t xml:space="preserve"> §4.</w:t>
       </w:r>
-    </w:p>
-    <w:p>
-      <w:pPr>
-        <w:pBdr>
-          <w:bottom w:val="single" w:color="999999" w:sz="6" w:space="1"/>
-        </w:pBdr>
-        <w:spacing w:after="200"/>
-      </w:pPr>
     </w:p>
     <w:p>
       <w:pPr>
@@ -8617,7 +8554,7 @@
     </w:tbl>
     <w:p>
       <w:pPr>
-        <w:spacing w:after="120"/>
+        <w:spacing w:after="0" w:before="0"/>
       </w:pPr>
     </w:p>
     <w:p>
@@ -8803,7 +8740,7 @@
     </w:tbl>
     <w:p>
       <w:pPr>
-        <w:spacing w:after="120"/>
+        <w:spacing w:after="0" w:before="0"/>
       </w:pPr>
     </w:p>
     <w:p>
@@ -8991,7 +8928,7 @@
           <w:ilvl w:val="0"/>
           <w:numId w:val="4"/>
         </w:numPr>
-        <w:spacing w:after="60"/>
+        <w:spacing w:after="240"/>
       </w:pPr>
       <w:r>
         <w:rPr>
@@ -9003,11 +8940,6 @@
       <w:r>
         <w:t xml:space="preserve"> Cloudflare corta a los ~100 segundos.</w:t>
       </w:r>
-    </w:p>
-    <w:p>
-      <w:pPr>
-        <w:spacing w:after="60"/>
-      </w:pPr>
     </w:p>
     <w:p>
       <w:pPr>
@@ -9177,7 +9109,7 @@
     </w:tbl>
     <w:p>
       <w:pPr>
-        <w:spacing w:after="120"/>
+        <w:spacing w:after="0" w:before="0"/>
       </w:pPr>
     </w:p>
     <w:p>
@@ -9280,7 +9212,7 @@
           <w:ilvl w:val="0"/>
           <w:numId w:val="4"/>
         </w:numPr>
-        <w:spacing w:after="60"/>
+        <w:spacing w:after="240"/>
       </w:pPr>
       <w:r>
         <w:t xml:space="preserve">El recordatorio </w:t>
@@ -9300,11 +9232,6 @@
     </w:p>
     <w:p>
       <w:pPr>
-        <w:spacing w:after="60"/>
-      </w:pPr>
-    </w:p>
-    <w:p>
-      <w:pPr>
         <w:spacing w:after="120"/>
       </w:pPr>
       <w:r>
@@ -9421,14 +9348,6 @@
         <w:t xml:space="preserve">
 Parte H.</w:t>
       </w:r>
-    </w:p>
-    <w:p>
-      <w:pPr>
-        <w:pBdr>
-          <w:bottom w:val="single" w:color="999999" w:sz="6" w:space="1"/>
-        </w:pBdr>
-        <w:spacing w:after="200"/>
-      </w:pPr>
     </w:p>
     <w:p>
       <w:pPr>
@@ -9664,14 +9583,6 @@
     </w:p>
     <w:p>
       <w:pPr>
-        <w:pBdr>
-          <w:bottom w:val="single" w:color="999999" w:sz="6" w:space="1"/>
-        </w:pBdr>
-        <w:spacing w:after="200"/>
-      </w:pPr>
-    </w:p>
-    <w:p>
-      <w:pPr>
         <w:pStyle w:val="Heading1"/>
         <w:pageBreakBefore/>
       </w:pPr>
@@ -9756,7 +9667,7 @@
         <w:pStyle w:val="Heading2"/>
       </w:pPr>
       <w:r>
-        <w:t xml:space="preserve">8.1 Tres niveles, no dos</w:t>
+        <w:t xml:space="preserve">8.1 Dos niveles de veredicto y una categoría aparte, historia</w:t>
       </w:r>
     </w:p>
     <w:p>
@@ -9764,50 +9675,61 @@
         <w:spacing w:after="120"/>
       </w:pPr>
       <w:r>
-        <w:t xml:space="preserve">Es la decisión de diseño que hace que la pantalla sirva. </w:t>
+        <w:t xml:space="preserve">Es la decisión de diseño que hace que la pantalla sirva. El veredicto tiene </w:t>
       </w:r>
       <w:r>
         <w:rPr>
           <w:b/>
           <w:bCs/>
         </w:rPr>
-        <w:t xml:space="preserve">Actuar</w:t>
-      </w:r>
-      <w:r>
-        <w:t xml:space="preserve"> es algo roto </w:t>
+        <w:t xml:space="preserve">dos</w:t>
+      </w:r>
+      <w:r>
+        <w:t xml:space="preserve"> niveles.
+</w:t>
       </w:r>
       <w:r>
         <w:rPr>
           <w:b/>
           <w:bCs/>
         </w:rPr>
-        <w:t xml:space="preserve">con una
-salida concreta que lo apaga</w:t>
-      </w:r>
-      <w:r>
-        <w:t xml:space="preserve">: es el único rojo, y lo único que cuenta para el punto rojo
-de cada pestaña. </w:t>
+        <w:t xml:space="preserve">Actuar</w:t>
+      </w:r>
+      <w:r>
+        <w:t xml:space="preserve"> es algo roto </w:t>
       </w:r>
       <w:r>
         <w:rPr>
           <w:b/>
           <w:bCs/>
         </w:rPr>
-        <w:t xml:space="preserve">Revisar</w:t>
-      </w:r>
-      <w:r>
-        <w:t xml:space="preserve"> son ausencias, colas normales y cruces sanos. </w:t>
+        <w:t xml:space="preserve">con una salida concreta que lo apaga</w:t>
+      </w:r>
+      <w:r>
+        <w:t xml:space="preserve">: es el único rojo, y lo
+único que cuenta para el punto rojo de cada pestaña. </w:t>
       </w:r>
       <w:r>
         <w:rPr>
           <w:b/>
           <w:bCs/>
         </w:rPr>
-        <w:t xml:space="preserve">Historia</w:t>
-      </w:r>
-      <w:r>
-        <w:t xml:space="preserve"> son
-los contadores acumulativos —total histórico de la bandeja, de divergencias, de fallidos—,
+        <w:t xml:space="preserve">Revisar</w:t>
+      </w:r>
+      <w:r>
+        <w:t xml:space="preserve"> son ausencias, colas
+normales y cruces sanos. Fuera del veredicto queda una tercera categoría, </w:t>
+      </w:r>
+      <w:r>
+        <w:rPr>
+          <w:b/>
+          <w:bCs/>
+        </w:rPr>
+        <w:t xml:space="preserve">historia</w:t>
+      </w:r>
+      <w:r>
+        <w:t xml:space="preserve">: los
+contadores acumulativos —total histórico de la bandeja, de divergencias, de fallidos—,
 redactados como contexto y </w:t>
       </w:r>
       <w:r>
@@ -10598,7 +10520,7 @@
     </w:tbl>
     <w:p>
       <w:pPr>
-        <w:spacing w:after="120"/>
+        <w:spacing w:after="0" w:before="0"/>
       </w:pPr>
     </w:p>
     <w:p>
@@ -10694,14 +10616,6 @@
       <w:r>
         <w:t xml:space="preserve">.</w:t>
       </w:r>
-    </w:p>
-    <w:p>
-      <w:pPr>
-        <w:pBdr>
-          <w:bottom w:val="single" w:color="999999" w:sz="6" w:space="1"/>
-        </w:pBdr>
-        <w:spacing w:after="200"/>
-      </w:pPr>
     </w:p>
     <w:p>
       <w:pPr>
@@ -11226,7 +11140,7 @@
     </w:tbl>
     <w:p>
       <w:pPr>
-        <w:spacing w:after="120"/>
+        <w:spacing w:after="0" w:before="0"/>
       </w:pPr>
     </w:p>
     <w:p>
@@ -11556,7 +11470,7 @@
     </w:tbl>
     <w:p>
       <w:pPr>
-        <w:spacing w:after="120"/>
+        <w:spacing w:after="0" w:before="0"/>
       </w:pPr>
     </w:p>
     <w:p>
@@ -11852,7 +11766,7 @@
     </w:tbl>
     <w:p>
       <w:pPr>
-        <w:spacing w:after="120"/>
+        <w:spacing w:after="0" w:before="0"/>
       </w:pPr>
     </w:p>
     <w:p>
@@ -11962,14 +11876,6 @@
       <w:r>
         <w:t xml:space="preserve"> §4.8.</w:t>
       </w:r>
-    </w:p>
-    <w:p>
-      <w:pPr>
-        <w:pBdr>
-          <w:bottom w:val="single" w:color="999999" w:sz="6" w:space="1"/>
-        </w:pBdr>
-        <w:spacing w:after="200"/>
-      </w:pPr>
     </w:p>
     <w:p>
       <w:pPr>
@@ -12077,17 +11983,12 @@
           <w:ilvl w:val="0"/>
           <w:numId w:val="5"/>
         </w:numPr>
-        <w:spacing w:after="60"/>
+        <w:spacing w:after="240"/>
       </w:pPr>
       <w:r>
         <w:t xml:space="preserve">Si hay suscripciones de Mercado Pago con importe divergente, esa misma pantalla ofrece el
 lote de actualización, que es de superadmin y pide confirmación explícita.</w:t>
       </w:r>
-    </w:p>
-    <w:p>
-      <w:pPr>
-        <w:spacing w:after="60"/>
-      </w:pPr>
     </w:p>
     <w:p>
       <w:pPr>
@@ -12178,7 +12079,7 @@
     </w:tbl>
     <w:p>
       <w:pPr>
-        <w:spacing w:after="120"/>
+        <w:spacing w:after="0" w:before="0"/>
       </w:pPr>
     </w:p>
     <w:p>
@@ -12228,7 +12129,7 @@
           <w:ilvl w:val="0"/>
           <w:numId w:val="6"/>
         </w:numPr>
-        <w:spacing w:after="60"/>
+        <w:spacing w:after="240"/>
       </w:pPr>
       <w:r>
         <w:t xml:space="preserve">Para el recordatorio, la misma llamada contra </w:t>
@@ -12257,11 +12158,6 @@
         <w:t xml:space="preserve">: un aviso perdido de un mes no se recupera al
 mes siguiente.</w:t>
       </w:r>
-    </w:p>
-    <w:p>
-      <w:pPr>
-        <w:spacing w:after="60"/>
-      </w:pPr>
     </w:p>
     <w:p>
       <w:pPr>
@@ -12342,7 +12238,7 @@
     </w:tbl>
     <w:p>
       <w:pPr>
-        <w:spacing w:after="120"/>
+        <w:spacing w:after="0" w:before="0"/>
       </w:pPr>
     </w:p>
     <w:p>
@@ -12420,16 +12316,11 @@
           <w:ilvl w:val="0"/>
           <w:numId w:val="7"/>
         </w:numPr>
-        <w:spacing w:after="60"/>
+        <w:spacing w:after="240"/>
       </w:pPr>
       <w:r>
         <w:t xml:space="preserve">Si aparecen filas nuevas en la bandeja, se resuelven desde Tesorería → Sin conciliar.</w:t>
       </w:r>
-    </w:p>
-    <w:p>
-      <w:pPr>
-        <w:spacing w:after="60"/>
-      </w:pPr>
     </w:p>
     <w:p>
       <w:pPr>
@@ -12543,17 +12434,12 @@
           <w:ilvl w:val="0"/>
           <w:numId w:val="8"/>
         </w:numPr>
-        <w:spacing w:after="60"/>
+        <w:spacing w:after="240"/>
       </w:pPr>
       <w:r>
         <w:t xml:space="preserve">Para quitar un rol hay dos guardas: nadie puede auto-degradarse de superadmin, y no se
 puede dejar al sistema sin ningún superadmin.</w:t>
       </w:r>
-    </w:p>
-    <w:p>
-      <w:pPr>
-        <w:spacing w:after="60"/>
-      </w:pPr>
     </w:p>
     <w:p>
       <w:pPr>
@@ -12643,7 +12529,7 @@
           <w:ilvl w:val="0"/>
           <w:numId w:val="9"/>
         </w:numPr>
-        <w:spacing w:after="60"/>
+        <w:spacing w:after="240"/>
       </w:pPr>
       <w:r>
         <w:t xml:space="preserve">Anular un recibo </w:t>
@@ -12659,11 +12545,6 @@
         <w:t xml:space="preserve"> el identificador del pago de Mercado Pago: si se borrara,
 un reenvío de la pasarela volvería a cobrar.</w:t>
       </w:r>
-    </w:p>
-    <w:p>
-      <w:pPr>
-        <w:spacing w:after="60"/>
-      </w:pPr>
     </w:p>
     <w:p>
       <w:pPr>
@@ -12773,16 +12654,11 @@
           <w:ilvl w:val="0"/>
           <w:numId w:val="10"/>
         </w:numPr>
-        <w:spacing w:after="60"/>
+        <w:spacing w:after="240"/>
       </w:pPr>
       <w:r>
         <w:t xml:space="preserve">Por qué importa: un socio expulsado con motivo "mora" pasaría la puerta del alta pública.</w:t>
       </w:r>
-    </w:p>
-    <w:p>
-      <w:pPr>
-        <w:spacing w:after="60"/>
-      </w:pPr>
     </w:p>
     <w:p>
       <w:pPr>
@@ -12950,16 +12826,11 @@
           <w:ilvl w:val="0"/>
           <w:numId w:val="11"/>
         </w:numPr>
-        <w:spacing w:after="60"/>
+        <w:spacing w:after="240"/>
       </w:pPr>
       <w:r>
         <w:t xml:space="preserve">Correr la verificación post-despliegue del capítulo 5.3.</w:t>
       </w:r>
-    </w:p>
-    <w:p>
-      <w:pPr>
-        <w:spacing w:after="60"/>
-      </w:pPr>
     </w:p>
     <w:p>
       <w:pPr>
@@ -13035,14 +12906,6 @@
       <w:r>
         <w:t xml:space="preserve">.</w:t>
       </w:r>
-    </w:p>
-    <w:p>
-      <w:pPr>
-        <w:pBdr>
-          <w:bottom w:val="single" w:color="999999" w:sz="6" w:space="1"/>
-        </w:pBdr>
-        <w:spacing w:after="200"/>
-      </w:pPr>
     </w:p>
     <w:p>
       <w:pPr>

</xml_diff>